<commit_message>
Exakt layoutparitet med originalrapporterna
Tre skillnader mot originalet, alla uppmatta i XML och nu atgardade.

Rubriker: originalet automatnumrerar via numId 10, vi renderade dem
onumrerade. Bara avfallsmallarna gor detta - de ovriga numrerar inte, sa
prototyperna extraheras per mall i stallet for att en regel antas galla
alla.

Punktlistor: originalet anvander numId 13 med indrag 720, vi arvde
stilens numId 7 med indrag 360, alltsa halva indraget.

Logotypen: mallarna hade <a:extLst/>, en tom tillagglista dar SVG-
referensen suttit. Word foll darfor tillbaka pa PNG-reserven pa 12 kB
i stallet for vektorn, vilket syns vid utskrift och inzoomning.

Tva skript gor arbetet reproducerbart och checkar in resultatet, sa
bygget aldrig beror pa att originalen finns lokalt.
</commit_message>
<xml_diff>
--- a/templates/avfall.docx
+++ b/templates/avfall.docx
@@ -208,7 +208,11 @@
                       </pic:nvPicPr>
                       <pic:blipFill>
                         <a:blip r:embed="rId9">
-                          <a:extLst/>
+                          <a:extLst>
+                            <a:ext uri="{96DAC541-7B7A-43D3-8B79-37D633B846F1}">
+                              <asvg:svgBlip xmlns:asvg="http://schemas.microsoft.com/office/drawing/2016/SVG/main" r:embed="rIdLogoSvg"/>
+                            </a:ext>
+                          </a:extLst>
                         </a:blip>
                         <a:stretch>
                           <a:fillRect/>

</xml_diff>